<commit_message>
Ajustes de hallazgos de repositorio
</commit_message>
<xml_diff>
--- a/fuentes/12310065_CF02_DU.docx
+++ b/fuentes/12310065_CF02_DU.docx
@@ -2945,7 +2945,17 @@
     </w:p>
     <w:p>
       <w:r>
-        <w:t>El componente formativo Identificación y aplicación de negocio se orienta al desarrollo de competencias relacionadas con la estructuración y puesta en marcha de ideas de negocio en contextos reales. En este sentido, se abordan elementos fundamentales como la organización administrativa, la definición de procesos y la formulación de propuestas empresariales con enfoque innovador.</w:t>
+        <w:t xml:space="preserve">El componente formativo </w:t>
+      </w:r>
+      <w:r>
+        <w:rPr>
+          <w:b/>
+          <w:bCs/>
+        </w:rPr>
+        <w:t>Identificación y aplicación de negocio</w:t>
+      </w:r>
+      <w:r>
+        <w:t xml:space="preserve"> se orienta al desarrollo de competencias relacionadas con la estructuración y puesta en marcha de ideas de negocio en contextos reales. En este sentido, se abordan elementos fundamentales como la organización administrativa, la definición de procesos y la formulación de propuestas empresariales con enfoque innovador.</w:t>
       </w:r>
     </w:p>
     <w:p>
@@ -3523,18 +3533,11 @@
       </w:r>
     </w:p>
     <w:p>
-      <w:pPr>
-        <w:rPr>
-          <w:b/>
-          <w:bCs/>
-        </w:rPr>
-      </w:pPr>
-      <w:r>
-        <w:rPr>
-          <w:b/>
-          <w:bCs/>
-        </w:rPr>
+      <w:r>
         <w:t>Clasificación de las unidades administrativas</w:t>
+      </w:r>
+      <w:r>
+        <w:t>:</w:t>
       </w:r>
     </w:p>
     <w:p>
@@ -3738,18 +3741,11 @@
       </w:r>
     </w:p>
     <w:p>
-      <w:pPr>
-        <w:rPr>
-          <w:b/>
-          <w:bCs/>
-        </w:rPr>
-      </w:pPr>
-      <w:r>
-        <w:rPr>
-          <w:b/>
-          <w:bCs/>
-        </w:rPr>
+      <w:r>
         <w:t>Elementos de la estructura administrativa</w:t>
+      </w:r>
+      <w:r>
+        <w:t>:</w:t>
       </w:r>
     </w:p>
     <w:p>
@@ -3972,56 +3968,49 @@
     <w:p>
       <w:pPr>
         <w:rPr>
-          <w:rStyle w:val="Extranjerismo"/>
           <w:b/>
           <w:bCs/>
         </w:rPr>
       </w:pPr>
       <w:r>
         <w:rPr>
-          <w:rStyle w:val="Extranjerismo"/>
           <w:b/>
           <w:bCs/>
         </w:rPr>
         <w:lastRenderedPageBreak/>
-        <w:t>Apple’s Organizational Structure and Its Characteristics (An Analysis)</w:t>
-      </w:r>
-    </w:p>
-    <w:p>
-      <w:r>
-        <w:t>Para profundizar en la aplicación real de la estructura organizacional en empresas globales (Apple), se invita al aprendiz a consultar el siguiente recurso:</w:t>
-      </w:r>
-      <w:r>
-        <w:t xml:space="preserve"> </w:t>
-      </w:r>
+        <w:t>Cómo la estructura organizativa de Apple impulsa la innovación y el éxito</w:t>
+      </w:r>
+    </w:p>
+    <w:p>
+      <w:r>
+        <w:t xml:space="preserve">Para </w:t>
+      </w:r>
+      <w:r>
+        <w:t xml:space="preserve">profundizar en la aplicación real de la estructura organizacional en empresas globales (Apple), </w:t>
+      </w:r>
+      <w:r>
+        <w:t xml:space="preserve">se invita al aprendiz a consultar el siguiente recurso: </w:t>
+      </w:r>
+    </w:p>
+    <w:p>
       <w:hyperlink r:id="rId13" w:history="1">
         <w:r>
           <w:rPr>
             <w:rStyle w:val="Hipervnculo"/>
           </w:rPr>
-          <w:t>https://panmore.com/apple-inc-organizational-structure-features-pros-cons</w:t>
+          <w:t>https://edraw.wondershare.es/org-chart/apple-organizational-structure.html</w:t>
         </w:r>
       </w:hyperlink>
       <w:r>
-        <w:t xml:space="preserve"> </w:t>
-      </w:r>
-      <w:r>
-        <w:t xml:space="preserve"> </w:t>
-      </w:r>
-    </w:p>
-    <w:p>
-      <w:pPr>
-        <w:rPr>
-          <w:b/>
-          <w:bCs/>
-        </w:rPr>
-      </w:pPr>
-      <w:r>
-        <w:rPr>
-          <w:b/>
-          <w:bCs/>
-        </w:rPr>
+        <w:t xml:space="preserve">   </w:t>
+      </w:r>
+    </w:p>
+    <w:p>
+      <w:r>
         <w:t>Elementos de la estructura organizacional</w:t>
+      </w:r>
+      <w:r>
+        <w:t>:</w:t>
       </w:r>
     </w:p>
     <w:p>
@@ -5312,21 +5301,26 @@
       </w:r>
     </w:p>
     <w:p>
+      <w:pPr>
+        <w:pStyle w:val="Figura"/>
+      </w:pPr>
+      <w:r>
+        <w:t>Ficha técnica de hamburguesa clásica de McDonald´s</w:t>
+      </w:r>
+    </w:p>
+    <w:p>
+      <w:pPr>
+        <w:jc w:val="center"/>
+      </w:pPr>
       <w:r>
         <w:rPr>
           <w:noProof/>
         </w:rPr>
         <w:drawing>
-          <wp:inline distT="0" distB="0" distL="0" distR="0" wp14:anchorId="52AE3EF0" wp14:editId="151A5285">
-            <wp:extent cx="5640779" cy="3104287"/>
-            <wp:effectExtent l="0" t="0" r="0" b="1270"/>
-            <wp:docPr id="206707456" name="Imagen 5" descr="Captura de pantalla del sitio web oficial de McDonald's que muestra la ficha técnica de la Hamburguesa Clásica.">
-              <a:extLst xmlns:a="http://schemas.openxmlformats.org/drawingml/2006/main">
-                <a:ext uri="{C183D7F6-B498-43B3-948B-1728B52AA6E4}">
-                  <adec:decorative xmlns:adec="http://schemas.microsoft.com/office/drawing/2017/decorative" val="0"/>
-                </a:ext>
-              </a:extLst>
-            </wp:docPr>
+          <wp:inline distT="0" distB="0" distL="0" distR="0" wp14:anchorId="6D930EBD" wp14:editId="25A4F8F0">
+            <wp:extent cx="5400000" cy="2963177"/>
+            <wp:effectExtent l="0" t="0" r="0" b="8890"/>
+            <wp:docPr id="1374966854" name="Imagen 3" descr="La figura muestra la ficha técnica de hamburguesa clásica de McDonald’s de 250 calorías y elaborada con carne de res, pepinillos, cebolla, kétchup y mostaza en un pan regular. La página muestra una fotografía del producto y complementa sus características con información sobre sus ingredientes y diferencias frente a otras hamburguesas. También presenta opciones para localizar restaurantes cercanos y realizar pedidos mediante los servicios digitales de McDonald’s. "/>
             <wp:cNvGraphicFramePr>
               <a:graphicFrameLocks xmlns:a="http://schemas.openxmlformats.org/drawingml/2006/main" noChangeAspect="1"/>
             </wp:cNvGraphicFramePr>
@@ -5334,39 +5328,29 @@
               <a:graphicData uri="http://schemas.openxmlformats.org/drawingml/2006/picture">
                 <pic:pic xmlns:pic="http://schemas.openxmlformats.org/drawingml/2006/picture">
                   <pic:nvPicPr>
-                    <pic:cNvPr id="206707456" name="Imagen 5" descr="Captura de pantalla del sitio web oficial de McDonald's que muestra la ficha técnica de la Hamburguesa Clásica.">
-                      <a:extLst>
-                        <a:ext uri="{C183D7F6-B498-43B3-948B-1728B52AA6E4}">
-                          <adec:decorative xmlns:adec="http://schemas.microsoft.com/office/drawing/2017/decorative" val="0"/>
-                        </a:ext>
-                      </a:extLst>
-                    </pic:cNvPr>
-                    <pic:cNvPicPr>
-                      <a:picLocks noChangeAspect="1" noChangeArrowheads="1"/>
-                    </pic:cNvPicPr>
+                    <pic:cNvPr id="1374966854" name="Imagen 3" descr="La figura muestra la ficha técnica de hamburguesa clásica de McDonald’s de 250 calorías y elaborada con carne de res, pepinillos, cebolla, kétchup y mostaza en un pan regular. La página muestra una fotografía del producto y complementa sus características con información sobre sus ingredientes y diferencias frente a otras hamburguesas. También presenta opciones para localizar restaurantes cercanos y realizar pedidos mediante los servicios digitales de McDonald’s. "/>
+                    <pic:cNvPicPr/>
                   </pic:nvPicPr>
                   <pic:blipFill>
-                    <a:blip r:embed="rId17">
+                    <a:blip r:embed="rId17" cstate="print">
                       <a:extLst>
                         <a:ext uri="{28A0092B-C50C-407E-A947-70E740481C1C}">
                           <a14:useLocalDpi xmlns:a14="http://schemas.microsoft.com/office/drawing/2010/main" val="0"/>
                         </a:ext>
                       </a:extLst>
                     </a:blip>
-                    <a:srcRect/>
                     <a:stretch>
                       <a:fillRect/>
                     </a:stretch>
                   </pic:blipFill>
-                  <pic:spPr bwMode="auto">
+                  <pic:spPr>
                     <a:xfrm>
                       <a:off x="0" y="0"/>
-                      <a:ext cx="5655748" cy="3112525"/>
+                      <a:ext cx="5400000" cy="2963177"/>
                     </a:xfrm>
                     <a:prstGeom prst="rect">
                       <a:avLst/>
                     </a:prstGeom>
-                    <a:noFill/>
                   </pic:spPr>
                 </pic:pic>
               </a:graphicData>
@@ -5377,11 +5361,11 @@
     </w:p>
     <w:p>
       <w:r>
-        <w:t xml:space="preserve">Esta captura de pantalla del sitio web oficial de McDonald's que muestra la ficha técnica de la Hamburguesa Clásica. A la izquierda, una imagen en alta resolución del producto ensamblado; a la derecha, el bloque de información que detalla el contenido </w:t>
+        <w:t xml:space="preserve">Esta captura de pantalla del sitio web oficial de McDonald's que muestra la ficha técnica de la Hamburguesa Clásica. A la izquierda, una imagen en alta resolución del </w:t>
       </w:r>
       <w:r>
         <w:lastRenderedPageBreak/>
-        <w:t xml:space="preserve">calórico (250 Cal.) y el procedimiento de preparación, especificando el uso de carne 100 % de res condimentada con sal y pimienta, pepinillos, cebolla picada, </w:t>
+        <w:t xml:space="preserve">producto ensamblado; a la derecha, el bloque de información que detalla el contenido calórico (250 Cal.) y el procedimiento de preparación, especificando el uso de carne 100 % de res condimentada con sal y pimienta, pepinillos, cebolla picada, </w:t>
       </w:r>
       <w:r>
         <w:rPr>
@@ -5660,6 +5644,7 @@
         </w:drawing>
       </w:r>
     </w:p>
+    <w:p/>
     <w:p>
       <w:r>
         <w:t>Nota. SENA, (2026).</w:t>
@@ -5774,18 +5759,11 @@
       </w:r>
     </w:p>
     <w:p>
-      <w:pPr>
-        <w:rPr>
-          <w:b/>
-          <w:bCs/>
-        </w:rPr>
-      </w:pPr>
-      <w:r>
-        <w:rPr>
-          <w:b/>
-          <w:bCs/>
-        </w:rPr>
+      <w:r>
         <w:t>Elementos de la formulación de la idea de negocio</w:t>
+      </w:r>
+      <w:r>
+        <w:t>:</w:t>
       </w:r>
     </w:p>
     <w:p>
@@ -7289,22 +7267,21 @@
     </w:p>
     <w:p>
       <w:pPr>
-        <w:pStyle w:val="Figura"/>
-        <w:numPr>
-          <w:ilvl w:val="0"/>
-          <w:numId w:val="0"/>
-        </w:numPr>
         <w:jc w:val="center"/>
+        <w:rPr>
+          <w:lang w:eastAsia="es-CO"/>
+        </w:rPr>
       </w:pPr>
       <w:r>
         <w:rPr>
           <w:noProof/>
+          <w:lang w:eastAsia="es-CO"/>
         </w:rPr>
         <w:drawing>
-          <wp:inline distT="0" distB="0" distL="0" distR="0" wp14:anchorId="5E43B93C" wp14:editId="4932DA25">
-            <wp:extent cx="5400000" cy="3600000"/>
-            <wp:effectExtent l="0" t="0" r="0" b="635"/>
-            <wp:docPr id="326458175" name="Imagen 8" descr="La figura describe los seis componentes esenciales de un plan de negocios; los cales son: Resumen ejecutivo, que sintetiza la idea, objetivos y propuesta de valor. Análisis de mercado, que estudia clientes, competencia y entorno; Plan de marketing, que define estrategias comerciales; Plan operativo, que describe procesos, recursos y logística; Plan financiero, que evalúa inversión, costos, ingresos y rentabilidad; y Aspectos legales, que contemplan requisitos normativos y obligaciones jurídicas. Cada componente está identificado con un número e iconos representativos. El mensaje final destaca que un plan de negocios bien estructurado favorece el éxito empresarial."/>
+          <wp:inline distT="0" distB="0" distL="0" distR="0" wp14:anchorId="35089069" wp14:editId="1BDEF658">
+            <wp:extent cx="5400000" cy="3594043"/>
+            <wp:effectExtent l="0" t="0" r="0" b="6985"/>
+            <wp:docPr id="2140625386" name="Imagen 5" descr="La figura describe los seis componentes esenciales de un plan de negocios; los cales son: Resumen ejecutivo, que sintetiza la idea, objetivos y propuesta de valor. Análisis de mercado, que estudia clientes, competencia y entorno; Plan de marketing, que define estrategias comerciales; Plan operativo, que describe procesos, recursos y logística; Plan financiero, que evalúa inversión, costos, ingresos y rentabilidad; y Aspectos legales, que contemplan requisitos normativos y obligaciones jurídicas. Cada componente está identificado con un número e iconos representativos. El mensaje final destaca que un plan de negocios bien estructurado favorece el éxito empresarial."/>
             <wp:cNvGraphicFramePr>
               <a:graphicFrameLocks xmlns:a="http://schemas.openxmlformats.org/drawingml/2006/main" noChangeAspect="1"/>
             </wp:cNvGraphicFramePr>
@@ -7312,36 +7289,29 @@
               <a:graphicData uri="http://schemas.openxmlformats.org/drawingml/2006/picture">
                 <pic:pic xmlns:pic="http://schemas.openxmlformats.org/drawingml/2006/picture">
                   <pic:nvPicPr>
-                    <pic:cNvPr id="0" name="Picture 9" descr="La figura describe los seis componentes esenciales de un plan de negocios; los cales son: Resumen ejecutivo, que sintetiza la idea, objetivos y propuesta de valor. Análisis de mercado, que estudia clientes, competencia y entorno; Plan de marketing, que define estrategias comerciales; Plan operativo, que describe procesos, recursos y logística; Plan financiero, que evalúa inversión, costos, ingresos y rentabilidad; y Aspectos legales, que contemplan requisitos normativos y obligaciones jurídicas. Cada componente está identificado con un número e iconos representativos. El mensaje final destaca que un plan de negocios bien estructurado favorece el éxito empresarial."/>
-                    <pic:cNvPicPr>
-                      <a:picLocks noChangeAspect="1" noChangeArrowheads="1"/>
-                    </pic:cNvPicPr>
+                    <pic:cNvPr id="2140625386" name="Imagen 5" descr="La figura describe los seis componentes esenciales de un plan de negocios; los cales son: Resumen ejecutivo, que sintetiza la idea, objetivos y propuesta de valor. Análisis de mercado, que estudia clientes, competencia y entorno; Plan de marketing, que define estrategias comerciales; Plan operativo, que describe procesos, recursos y logística; Plan financiero, que evalúa inversión, costos, ingresos y rentabilidad; y Aspectos legales, que contemplan requisitos normativos y obligaciones jurídicas. Cada componente está identificado con un número e iconos representativos. El mensaje final destaca que un plan de negocios bien estructurado favorece el éxito empresarial."/>
+                    <pic:cNvPicPr/>
                   </pic:nvPicPr>
                   <pic:blipFill>
-                    <a:blip r:embed="rId23">
+                    <a:blip r:embed="rId23" cstate="print">
                       <a:extLst>
                         <a:ext uri="{28A0092B-C50C-407E-A947-70E740481C1C}">
                           <a14:useLocalDpi xmlns:a14="http://schemas.microsoft.com/office/drawing/2010/main" val="0"/>
                         </a:ext>
                       </a:extLst>
                     </a:blip>
-                    <a:srcRect/>
                     <a:stretch>
                       <a:fillRect/>
                     </a:stretch>
                   </pic:blipFill>
-                  <pic:spPr bwMode="auto">
+                  <pic:spPr>
                     <a:xfrm>
                       <a:off x="0" y="0"/>
-                      <a:ext cx="5400000" cy="3600000"/>
+                      <a:ext cx="5400000" cy="3594043"/>
                     </a:xfrm>
                     <a:prstGeom prst="rect">
                       <a:avLst/>
                     </a:prstGeom>
-                    <a:noFill/>
-                    <a:ln>
-                      <a:noFill/>
-                    </a:ln>
                   </pic:spPr>
                 </pic:pic>
               </a:graphicData>
@@ -9247,7 +9217,13 @@
               </w:rPr>
             </w:pPr>
             <w:r>
-              <w:t>Centro de Comercio y Servicios – Regional Atlántico</w:t>
+              <w:t xml:space="preserve">Centro de Comercio y Servicios </w:t>
+            </w:r>
+            <w:r>
+              <w:t>-</w:t>
+            </w:r>
+            <w:r>
+              <w:t xml:space="preserve"> Regional Atlántico</w:t>
             </w:r>
           </w:p>
         </w:tc>
@@ -9403,7 +9379,13 @@
               </w:rPr>
             </w:pPr>
             <w:r>
-              <w:t>Centro de Comercio y Servicios – Regional Atlántico</w:t>
+              <w:t xml:space="preserve">Centro de Comercio y Servicios </w:t>
+            </w:r>
+            <w:r>
+              <w:t>-</w:t>
+            </w:r>
+            <w:r>
+              <w:t xml:space="preserve"> Regional Atlántico</w:t>
             </w:r>
           </w:p>
         </w:tc>
@@ -9459,7 +9441,13 @@
               </w:rPr>
             </w:pPr>
             <w:r>
-              <w:t>Centro de Comercio y Servicios – Regional Atlántico</w:t>
+              <w:t xml:space="preserve">Centro de Comercio y Servicios </w:t>
+            </w:r>
+            <w:r>
+              <w:t>-</w:t>
+            </w:r>
+            <w:r>
+              <w:t xml:space="preserve"> Regional Atlántico</w:t>
             </w:r>
           </w:p>
         </w:tc>
@@ -9509,7 +9497,13 @@
               </w:rPr>
             </w:pPr>
             <w:r>
-              <w:t>Centro de Comercio y Servicios – Regional Atlántico</w:t>
+              <w:t xml:space="preserve">Centro de Comercio y Servicios </w:t>
+            </w:r>
+            <w:r>
+              <w:t>-</w:t>
+            </w:r>
+            <w:r>
+              <w:t xml:space="preserve"> Regional Atlántico</w:t>
             </w:r>
           </w:p>
         </w:tc>
@@ -9556,7 +9550,13 @@
               </w:rPr>
             </w:pPr>
             <w:r>
-              <w:t>Centro de Comercio y Servicios – Regional Atlántico</w:t>
+              <w:t xml:space="preserve">Centro de Comercio y Servicios </w:t>
+            </w:r>
+            <w:r>
+              <w:t>-</w:t>
+            </w:r>
+            <w:r>
+              <w:t xml:space="preserve"> Regional Atlántico</w:t>
             </w:r>
           </w:p>
         </w:tc>
@@ -9606,7 +9606,13 @@
               </w:rPr>
             </w:pPr>
             <w:r>
-              <w:t>Centro de Comercio y Servicios – Regional Atlántico</w:t>
+              <w:t xml:space="preserve">Centro de Comercio y Servicios </w:t>
+            </w:r>
+            <w:r>
+              <w:t>-</w:t>
+            </w:r>
+            <w:r>
+              <w:t xml:space="preserve"> Regional Atlántico</w:t>
             </w:r>
           </w:p>
         </w:tc>
@@ -9656,7 +9662,13 @@
               </w:rPr>
             </w:pPr>
             <w:r>
-              <w:t>Centro de Comercio y Servicios – Regional Atlántico</w:t>
+              <w:t xml:space="preserve">Centro de Comercio y Servicios </w:t>
+            </w:r>
+            <w:r>
+              <w:t>-</w:t>
+            </w:r>
+            <w:r>
+              <w:t xml:space="preserve"> Regional Atlántico</w:t>
             </w:r>
           </w:p>
         </w:tc>
@@ -9709,7 +9721,13 @@
               </w:rPr>
             </w:pPr>
             <w:r>
-              <w:t>Centro de Comercio y Servicios – Regional Atlántico</w:t>
+              <w:t xml:space="preserve">Centro de Comercio y Servicios </w:t>
+            </w:r>
+            <w:r>
+              <w:t>-</w:t>
+            </w:r>
+            <w:r>
+              <w:t xml:space="preserve"> Regional Atlántico</w:t>
             </w:r>
           </w:p>
         </w:tc>
@@ -9760,7 +9778,13 @@
               </w:rPr>
             </w:pPr>
             <w:r>
-              <w:t>Centro de Comercio y Servicios – Regional Atlántico</w:t>
+              <w:t xml:space="preserve">Centro de Comercio y Servicios </w:t>
+            </w:r>
+            <w:r>
+              <w:t>-</w:t>
+            </w:r>
+            <w:r>
+              <w:t xml:space="preserve"> Regional Atlántico</w:t>
             </w:r>
           </w:p>
         </w:tc>
@@ -15585,6 +15609,30 @@
 </file>
 
 <file path=customXml/item1.xml><?xml version="1.0" encoding="utf-8"?>
+<p:properties xmlns:p="http://schemas.microsoft.com/office/2006/metadata/properties" xmlns:xsi="http://www.w3.org/2001/XMLSchema-instance" xmlns:pc="http://schemas.microsoft.com/office/infopath/2007/PartnerControls">
+  <documentManagement>
+    <TaxCatchAll xmlns="67a0edcd-0de5-43ed-8c27-e32f38a00c91" xsi:nil="true"/>
+    <lcf76f155ced4ddcb4097134ff3c332f xmlns="42760c81-fd8e-4d59-8953-7cdb9f38b14f">
+      <Terms xmlns="http://schemas.microsoft.com/office/infopath/2007/PartnerControls"/>
+    </lcf76f155ced4ddcb4097134ff3c332f>
+  </documentManagement>
+</p:properties>
+</file>
+
+<file path=customXml/item2.xml><?xml version="1.0" encoding="utf-8"?>
+<?mso-contentType ?>
+<FormTemplates xmlns="http://schemas.microsoft.com/sharepoint/v3/contenttype/forms">
+  <Display>DocumentLibraryForm</Display>
+  <Edit>DocumentLibraryForm</Edit>
+  <New>DocumentLibraryForm</New>
+</FormTemplates>
+</file>
+
+<file path=customXml/item3.xml><?xml version="1.0" encoding="utf-8"?>
+<b:Sources xmlns:b="http://schemas.openxmlformats.org/officeDocument/2006/bibliography" xmlns="http://schemas.openxmlformats.org/officeDocument/2006/bibliography" SelectedStyle="\APASixthEditionOfficeOnline.xsl" StyleName="APA" Version="6"/>
+</file>
+
+<file path=customXml/item4.xml><?xml version="1.0" encoding="utf-8"?>
 <ct:contentTypeSchema xmlns:ct="http://schemas.microsoft.com/office/2006/metadata/contentType" xmlns:ma="http://schemas.microsoft.com/office/2006/metadata/properties/metaAttributes" ct:_="" ma:_="" ma:contentTypeName="Documento" ma:contentTypeID="0x01010005252A1EF3BD024F856B47B579AB5244" ma:contentTypeVersion="12" ma:contentTypeDescription="Crear nuevo documento." ma:contentTypeScope="" ma:versionID="32d0e18b85ac20c34eab62df21c0cf58">
   <xsd:schema xmlns:xsd="http://www.w3.org/2001/XMLSchema" xmlns:xs="http://www.w3.org/2001/XMLSchema" xmlns:p="http://schemas.microsoft.com/office/2006/metadata/properties" xmlns:ns2="42760c81-fd8e-4d59-8953-7cdb9f38b14f" xmlns:ns3="67a0edcd-0de5-43ed-8c27-e32f38a00c91" targetNamespace="http://schemas.microsoft.com/office/2006/metadata/properties" ma:root="true" ma:fieldsID="cc2c149e99f10870fd5bc3964e5386d3" ns2:_="" ns3:_="">
     <xsd:import namespace="42760c81-fd8e-4d59-8953-7cdb9f38b14f"/>
@@ -15785,51 +15833,7 @@
 </ct:contentTypeSchema>
 </file>
 
-<file path=customXml/item2.xml><?xml version="1.0" encoding="utf-8"?>
-<b:Sources xmlns:b="http://schemas.openxmlformats.org/officeDocument/2006/bibliography" xmlns="http://schemas.openxmlformats.org/officeDocument/2006/bibliography" SelectedStyle="\APASixthEditionOfficeOnline.xsl" StyleName="APA" Version="6"/>
-</file>
-
-<file path=customXml/item3.xml><?xml version="1.0" encoding="utf-8"?>
-<?mso-contentType ?>
-<FormTemplates xmlns="http://schemas.microsoft.com/sharepoint/v3/contenttype/forms">
-  <Display>DocumentLibraryForm</Display>
-  <Edit>DocumentLibraryForm</Edit>
-  <New>DocumentLibraryForm</New>
-</FormTemplates>
-</file>
-
-<file path=customXml/item4.xml><?xml version="1.0" encoding="utf-8"?>
-<p:properties xmlns:p="http://schemas.microsoft.com/office/2006/metadata/properties" xmlns:xsi="http://www.w3.org/2001/XMLSchema-instance" xmlns:pc="http://schemas.microsoft.com/office/infopath/2007/PartnerControls">
-  <documentManagement>
-    <TaxCatchAll xmlns="67a0edcd-0de5-43ed-8c27-e32f38a00c91" xsi:nil="true"/>
-    <lcf76f155ced4ddcb4097134ff3c332f xmlns="42760c81-fd8e-4d59-8953-7cdb9f38b14f">
-      <Terms xmlns="http://schemas.microsoft.com/office/infopath/2007/PartnerControls"/>
-    </lcf76f155ced4ddcb4097134ff3c332f>
-  </documentManagement>
-</p:properties>
-</file>
-
 <file path=customXml/itemProps1.xml><?xml version="1.0" encoding="utf-8"?>
-<ds:datastoreItem xmlns:ds="http://schemas.openxmlformats.org/officeDocument/2006/customXml" ds:itemID="{DB29499F-AD28-4C3D-B2E8-75B6305789F8}"/>
-</file>
-
-<file path=customXml/itemProps2.xml><?xml version="1.0" encoding="utf-8"?>
-<ds:datastoreItem xmlns:ds="http://schemas.openxmlformats.org/officeDocument/2006/customXml" ds:itemID="{EAE431FD-7059-4C09-804B-C9D69EB7B213}">
-  <ds:schemaRefs>
-    <ds:schemaRef ds:uri="http://schemas.openxmlformats.org/officeDocument/2006/bibliography"/>
-  </ds:schemaRefs>
-</ds:datastoreItem>
-</file>
-
-<file path=customXml/itemProps3.xml><?xml version="1.0" encoding="utf-8"?>
-<ds:datastoreItem xmlns:ds="http://schemas.openxmlformats.org/officeDocument/2006/customXml" ds:itemID="{10663269-2064-4804-8290-36D4A57F5557}">
-  <ds:schemaRefs>
-    <ds:schemaRef ds:uri="http://schemas.microsoft.com/sharepoint/v3/contenttype/forms"/>
-  </ds:schemaRefs>
-</ds:datastoreItem>
-</file>
-
-<file path=customXml/itemProps4.xml><?xml version="1.0" encoding="utf-8"?>
 <ds:datastoreItem xmlns:ds="http://schemas.openxmlformats.org/officeDocument/2006/customXml" ds:itemID="{1279454D-02BE-4A9C-A117-DCD1573E2608}">
   <ds:schemaRefs>
     <ds:schemaRef ds:uri="http://schemas.microsoft.com/office/2006/metadata/properties"/>
@@ -15838,4 +15842,24 @@
     <ds:schemaRef ds:uri="13c93bba-48ce-428c-bfe5-88b42c19b028"/>
   </ds:schemaRefs>
 </ds:datastoreItem>
+</file>
+
+<file path=customXml/itemProps2.xml><?xml version="1.0" encoding="utf-8"?>
+<ds:datastoreItem xmlns:ds="http://schemas.openxmlformats.org/officeDocument/2006/customXml" ds:itemID="{10663269-2064-4804-8290-36D4A57F5557}">
+  <ds:schemaRefs>
+    <ds:schemaRef ds:uri="http://schemas.microsoft.com/sharepoint/v3/contenttype/forms"/>
+  </ds:schemaRefs>
+</ds:datastoreItem>
+</file>
+
+<file path=customXml/itemProps3.xml><?xml version="1.0" encoding="utf-8"?>
+<ds:datastoreItem xmlns:ds="http://schemas.openxmlformats.org/officeDocument/2006/customXml" ds:itemID="{EAE431FD-7059-4C09-804B-C9D69EB7B213}">
+  <ds:schemaRefs>
+    <ds:schemaRef ds:uri="http://schemas.openxmlformats.org/officeDocument/2006/bibliography"/>
+  </ds:schemaRefs>
+</ds:datastoreItem>
+</file>
+
+<file path=customXml/itemProps4.xml><?xml version="1.0" encoding="utf-8"?>
+<ds:datastoreItem xmlns:ds="http://schemas.openxmlformats.org/officeDocument/2006/customXml" ds:itemID="{A840037F-B5E9-4011-9699-025388A61399}"/>
 </file>
</xml_diff>